<commit_message>
Les fiches declarent ce qu'Atmart a ecrit
`_traduisible.json` accompagne desormais les six fiches : la liste des 123
phrases redigees par Atmart et des 17 gabarits a variables. Elle dit a la
page publique ce qui se traduit et ce qui ne se traduit pas — un nom de
producteur, un code de passeport, le nom d'une licence n'ont qu'un nom.

Seul changement de texte : `ecart_modere` et `desaccord` etaient des clefs de
programme affichees telles quelles, jusque dans le .docx envoye aux
prospects. Elles portent maintenant leur libelle. Le reste des six .md est
sorti identique octet pour octet.

Co-Authored-By: Claude Opus 5 <noreply@anthropic.com>
</commit_message>
<xml_diff>
--- a/docs/datasheets/ecoles_declarees.docx
+++ b/docs/datasheets/ecoles_declarees.docx
@@ -418,7 +418,7 @@
           </w:tcPr>
           <w:p>
             <w:r>
-              <w:t>ecart_modere</w:t>
+              <w:t>écart modéré</w:t>
             </w:r>
           </w:p>
         </w:tc>
@@ -440,7 +440,7 @@
           </w:tcPr>
           <w:p>
             <w:r>
-              <w:t>desaccord</w:t>
+              <w:t>fort désaccord</w:t>
             </w:r>
           </w:p>
         </w:tc>

</xml_diff>